<commit_message>
chore: archive older manuscript versions and add Chapter 1 version 4.0
</commit_message>
<xml_diff>
--- a/thesis_docs/manuscripts/archive/ChpI v2.docx
+++ b/thesis_docs/manuscripts/archive/ChpI v2.docx
@@ -77,138 +77,7 @@
         <w:rPr>
           <w:color w:val="000000" w:themeColor="text1"/>
         </w:rPr>
-        <w:t xml:space="preserve"> &amp; Romano, 2017). </w:t>
-      </w:r>
-      <w:r>
-        <w:rPr>
-          <w:color w:val="000000" w:themeColor="text1"/>
-        </w:rPr>
-        <w:t>Barriers such as p</w:t>
-      </w:r>
-      <w:r>
-        <w:rPr>
-          <w:color w:val="000000" w:themeColor="text1"/>
-        </w:rPr>
-        <w:t>rohibitive capital costs</w:t>
-      </w:r>
-      <w:r>
-        <w:rPr>
-          <w:color w:val="000000" w:themeColor="text1"/>
-        </w:rPr>
-        <w:t xml:space="preserve"> and</w:t>
-      </w:r>
-      <w:r>
-        <w:rPr>
-          <w:color w:val="000000" w:themeColor="text1"/>
-        </w:rPr>
-        <w:t xml:space="preserve"> municipal land constraints</w:t>
-      </w:r>
-      <w:r>
-        <w:rPr>
-          <w:color w:val="000000" w:themeColor="text1"/>
-        </w:rPr>
-        <w:t xml:space="preserve"> </w:t>
-      </w:r>
-      <w:r>
-        <w:rPr>
-          <w:color w:val="000000" w:themeColor="text1"/>
-        </w:rPr>
-        <w:t>severely restrict physical terminal expansion (</w:t>
-      </w:r>
-      <w:proofErr w:type="spellStart"/>
-      <w:r>
-        <w:rPr>
-          <w:color w:val="000000" w:themeColor="text1"/>
-        </w:rPr>
-        <w:t>AlKheder</w:t>
-      </w:r>
-      <w:proofErr w:type="spellEnd"/>
-      <w:r>
-        <w:rPr>
-          <w:color w:val="000000" w:themeColor="text1"/>
-        </w:rPr>
-        <w:t xml:space="preserve"> et al., 2024; </w:t>
-      </w:r>
-      <w:proofErr w:type="spellStart"/>
-      <w:r>
-        <w:rPr>
-          <w:color w:val="000000" w:themeColor="text1"/>
-        </w:rPr>
-        <w:t>Balliauw</w:t>
-      </w:r>
-      <w:proofErr w:type="spellEnd"/>
-      <w:r>
-        <w:rPr>
-          <w:color w:val="000000" w:themeColor="text1"/>
-        </w:rPr>
-        <w:t xml:space="preserve"> &amp; </w:t>
-      </w:r>
-      <w:proofErr w:type="spellStart"/>
-      <w:r>
-        <w:rPr>
-          <w:color w:val="000000" w:themeColor="text1"/>
-        </w:rPr>
-        <w:t>Onghena</w:t>
-      </w:r>
-      <w:proofErr w:type="spellEnd"/>
-      <w:r>
-        <w:rPr>
-          <w:color w:val="000000" w:themeColor="text1"/>
-        </w:rPr>
-        <w:t xml:space="preserve">, 2020; De Neufville &amp; </w:t>
-      </w:r>
-      <w:proofErr w:type="spellStart"/>
-      <w:r>
-        <w:rPr>
-          <w:color w:val="000000" w:themeColor="text1"/>
-        </w:rPr>
-        <w:t>Odoni</w:t>
-      </w:r>
-      <w:proofErr w:type="spellEnd"/>
-      <w:r>
-        <w:rPr>
-          <w:color w:val="000000" w:themeColor="text1"/>
-        </w:rPr>
-        <w:t>, 2014; Ozores, 2026). Consequently, airport operators and federal security authorities must extract maximum operational throughput from fixed physical assets through software-driven predictive intelligence.</w:t>
-      </w:r>
-    </w:p>
-    <w:p>
-      <w:pPr>
-        <w:rPr>
-          <w:color w:val="000000" w:themeColor="text1"/>
-        </w:rPr>
-      </w:pPr>
-      <w:r>
-        <w:rPr>
-          <w:color w:val="000000" w:themeColor="text1"/>
-        </w:rPr>
-        <w:t xml:space="preserve">While predictive models are widely deployed to anticipate terminal demand, the systemic disruptions of the COVID-19 pandemic and subsequent recovery exposed critical vulnerabilities in traditional, accuracy-centric evaluation standards (Sun, </w:t>
-      </w:r>
-      <w:proofErr w:type="spellStart"/>
-      <w:r>
-        <w:rPr>
-          <w:color w:val="000000" w:themeColor="text1"/>
-        </w:rPr>
-        <w:t>Wandelt</w:t>
-      </w:r>
-      <w:proofErr w:type="spellEnd"/>
-      <w:r>
-        <w:rPr>
-          <w:color w:val="000000" w:themeColor="text1"/>
-        </w:rPr>
-        <w:t>, &amp; Zhang, 2022).</w:t>
-      </w:r>
-      <w:r>
-        <w:rPr>
-          <w:color w:val="000000" w:themeColor="text1"/>
-        </w:rPr>
-        <w:t xml:space="preserve"> </w:t>
-      </w:r>
-      <w:r>
-        <w:rPr>
-          <w:color w:val="000000" w:themeColor="text1"/>
-        </w:rPr>
-        <w:t>These unprecedented operational disruptions demonstrated that conventional accuracy metrics, while necessary, are insufficient as the sole basis for evaluating models intended for volatile airport operating environments. Specifically, the pandemic revealed that a singular evaluation standard is inadequate across highly variable operational contexts, necessitating the assessment of predictive models through a broader, multidimensional set of performance measures. In airport operations, the most useful predictive model is therefore not necessarily the one with the lowest average forecast error but the model that:</w:t>
+        <w:t xml:space="preserve"> &amp; Romano, 2017). While existing predictive models are increasingly used to forecast airport passenger flow management, the systemic shocks of the COVID-19 pandemic underscored limitations within traditional, accuracy-centric performance metrics to handle abrupt demand shocks, structural breaks, and changing operating constraints. These unprecedented operational disruptions demonstrated that conventional accuracy metrics, while necessary, are insufficient as the sole basis for evaluating models intended for volatile airport operating environments. Specifically, the pandemic revealed that a singular evaluation standard is inadequate across highly variable operational contexts, necessitating the assessment of predictive models through a broader, multidimensional set of performance measures. In airport operations, the most useful predictive model is therefore not necessarily the one with the lowest average forecast error but the model that:</w:t>
       </w:r>
     </w:p>
     <w:p>
@@ -231,25 +100,7 @@
           <w:bCs/>
           <w:color w:val="000000" w:themeColor="text1"/>
         </w:rPr>
-        <w:t>Robustness (</w:t>
-      </w:r>
-      <w:r>
-        <w:rPr>
-          <w:rFonts w:ascii="Times New Roman" w:hAnsi="Times New Roman" w:cs="Times New Roman"/>
-          <w:b/>
-          <w:bCs/>
-          <w:color w:val="000000" w:themeColor="text1"/>
-        </w:rPr>
-        <w:t>Remains reliable during routine operations</w:t>
-      </w:r>
-      <w:r>
-        <w:rPr>
-          <w:rFonts w:ascii="Times New Roman" w:hAnsi="Times New Roman" w:cs="Times New Roman"/>
-          <w:b/>
-          <w:bCs/>
-          <w:color w:val="000000" w:themeColor="text1"/>
-        </w:rPr>
-        <w:t>)</w:t>
+        <w:t>Remains reliable during routine operations (Robustness)</w:t>
       </w:r>
       <w:r>
         <w:rPr>
@@ -279,26 +130,7 @@
           <w:bCs/>
           <w:color w:val="000000" w:themeColor="text1"/>
         </w:rPr>
-        <w:lastRenderedPageBreak/>
-        <w:t>Resilience (</w:t>
-      </w:r>
-      <w:r>
-        <w:rPr>
-          <w:rFonts w:ascii="Times New Roman" w:hAnsi="Times New Roman" w:cs="Times New Roman"/>
-          <w:b/>
-          <w:bCs/>
-          <w:color w:val="000000" w:themeColor="text1"/>
-        </w:rPr>
-        <w:t>Maintains stability and recovers rapidly during disruptions</w:t>
-      </w:r>
-      <w:r>
-        <w:rPr>
-          <w:rFonts w:ascii="Times New Roman" w:hAnsi="Times New Roman" w:cs="Times New Roman"/>
-          <w:b/>
-          <w:bCs/>
-          <w:color w:val="000000" w:themeColor="text1"/>
-        </w:rPr>
-        <w:t>)</w:t>
+        <w:t>Maintains stability and recovers rapidly during disruptions (Resilience)</w:t>
       </w:r>
       <w:r>
         <w:rPr>
@@ -328,43 +160,7 @@
           <w:bCs/>
           <w:color w:val="000000" w:themeColor="text1"/>
         </w:rPr>
-        <w:t>Generalizability</w:t>
-      </w:r>
-      <w:r>
-        <w:rPr>
-          <w:rFonts w:ascii="Times New Roman" w:hAnsi="Times New Roman" w:cs="Times New Roman"/>
-          <w:b/>
-          <w:bCs/>
-          <w:color w:val="000000" w:themeColor="text1"/>
-        </w:rPr>
-        <w:t xml:space="preserve"> </w:t>
-      </w:r>
-      <w:r>
-        <w:rPr>
-          <w:rFonts w:ascii="Times New Roman" w:hAnsi="Times New Roman" w:cs="Times New Roman"/>
-          <w:b/>
-          <w:bCs/>
-          <w:color w:val="000000" w:themeColor="text1"/>
-        </w:rPr>
-        <w:t>(</w:t>
-      </w:r>
-      <w:r>
-        <w:rPr>
-          <w:rFonts w:ascii="Times New Roman" w:hAnsi="Times New Roman" w:cs="Times New Roman"/>
-          <w:b/>
-          <w:bCs/>
-          <w:color w:val="000000" w:themeColor="text1"/>
-        </w:rPr>
-        <w:t>Transfers effectively across operational contexts</w:t>
-      </w:r>
-      <w:r>
-        <w:rPr>
-          <w:rFonts w:ascii="Times New Roman" w:hAnsi="Times New Roman" w:cs="Times New Roman"/>
-          <w:b/>
-          <w:bCs/>
-          <w:color w:val="000000" w:themeColor="text1"/>
-        </w:rPr>
-        <w:t>)</w:t>
+        <w:t>Transfers effectively across operational contexts (Generalizability)</w:t>
       </w:r>
       <w:r>
         <w:rPr>
@@ -384,7 +180,8 @@
         <w:rPr>
           <w:color w:val="000000" w:themeColor="text1"/>
         </w:rPr>
-        <w:t>This study examines the suitability of predictive modeling frameworks – spanning deterministic operational baselines (such as persistence and scheduled flight bank dispersion), data-driven decision-tree architectures (automated rule-based machine learning models), and sequential two-stage hybrid models (combining schedule baselines with real-time error correction) – for forecasting Transportation Security Administration (TSA) checkpoint throughput volatility across routine, volatile, and disrupted demand regimes.</w:t>
+        <w:lastRenderedPageBreak/>
+        <w:t>This study systematically examines the suitability of predictive modeling frameworks – spanning deterministic operational baselines (such as persistence and scheduled flight bank dispersion), data-driven decision-tree architectures (automated rule-based machine learning models), and sequential two-stage hybrid models (combining schedule baselines with real-time error correction) – for forecasting Transportation Security Administration (TSA) checkpoint throughput volatility across routine, volatile, and disrupted demand regimes.</w:t>
       </w:r>
     </w:p>
     <w:p>
@@ -393,8 +190,6 @@
         <w:spacing w:before="0" w:after="0" w:line="480" w:lineRule="auto"/>
         <w:rPr>
           <w:rFonts w:ascii="Times New Roman" w:hAnsi="Times New Roman" w:cs="Times New Roman"/>
-          <w:b/>
-          <w:bCs/>
           <w:color w:val="000000" w:themeColor="text1"/>
           <w:sz w:val="24"/>
           <w:szCs w:val="24"/>
@@ -405,8 +200,6 @@
       <w:r>
         <w:rPr>
           <w:rFonts w:ascii="Times New Roman" w:hAnsi="Times New Roman" w:cs="Times New Roman"/>
-          <w:b/>
-          <w:bCs/>
           <w:color w:val="000000" w:themeColor="text1"/>
           <w:sz w:val="24"/>
           <w:szCs w:val="24"/>
@@ -454,7 +247,6 @@
           <w:sz w:val="24"/>
           <w:szCs w:val="24"/>
         </w:rPr>
-        <w:lastRenderedPageBreak/>
         <w:t>Statement of the Problem</w:t>
       </w:r>
       <w:bookmarkEnd w:id="6"/>
@@ -498,7 +290,14 @@
         <w:rPr>
           <w:color w:val="000000" w:themeColor="text1"/>
         </w:rPr>
-        <w:t>, 2025). Existing models for managing airport passenger flow tend to rely on static or pre‑pandemic assumptions, consequentially failing to account for unpredictable post‑pandemic travel patterns (Ebert, Dutta, Mengersen, Mira, Ruggeri, &amp; Wu, 2021; Hopfe, Lee &amp; Yu, 2024). This mismatch between capacity planning and fluctuating passenger demand contributes to bottlenecks at check‑in counters, TSA checkpoints, and boarding gates, ultimately leading to congestion and inefficient resource allocation. While recent global disruptions have proven that historical baselines are insufficient for contemporary airport logistics, the aviation sector currently lacks a dynamic framework for evaluating predictive models beyond standard accuracy metrics. Because modern forecasting can no longer remain predicated on deterministic conditions, the absence of an adaptable evaluation methodology leaves airports at risk of deploying tools that fail to respond to sudden demand shocks or generalize across shifting operational realities.</w:t>
+        <w:t xml:space="preserve">, 2025). Existing models for managing airport passenger flow tend to rely on static or pre‑pandemic assumptions, consequentially failing to account for unpredictable post‑pandemic travel patterns (Ebert, Dutta, Mengersen, Mira, Ruggeri, &amp; Wu, 2021; Hopfe, Lee &amp; Yu, 2024). This mismatch between capacity planning and fluctuating passenger demand contributes to bottlenecks at check‑in counters, TSA checkpoints, and boarding gates, ultimately </w:t>
+      </w:r>
+      <w:r>
+        <w:rPr>
+          <w:color w:val="000000" w:themeColor="text1"/>
+        </w:rPr>
+        <w:lastRenderedPageBreak/>
+        <w:t>leading to congestion and inefficient resource allocation. While recent global disruptions have proven that historical baselines are insufficient for contemporary airport logistics, the aviation sector currently lacks a dynamic framework for evaluating predictive models beyond standard accuracy metrics. Because modern forecasting can no longer remain predicated on deterministic conditions, the absence of an adaptable evaluation methodology leaves airports at risk of deploying tools that fail to respond to sudden demand shocks or generalize across shifting operational realities.</w:t>
       </w:r>
     </w:p>
     <w:p>
@@ -540,14 +339,7 @@
         <w:rPr>
           <w:color w:val="000000" w:themeColor="text1"/>
         </w:rPr>
-        <w:t xml:space="preserve">The primary objective is to evaluate predictive modeling techniques, such as regression, machine learning, and queuing simulation, to optimize airport capacity via technological rather than physical – and more costly – intervention. By analyzing the relationship between flight operations and TSA throughput, this study evaluates various predictive modeling frameworks against the primary criteria of robustness, resilience, and generalizability. Rather than seeking a singular, universally optimal model, this research identifies which frameworks perform best under each distinct metric. Ultimately, this comparative analysis provides management with the </w:t>
-      </w:r>
-      <w:r>
-        <w:rPr>
-          <w:color w:val="000000" w:themeColor="text1"/>
-        </w:rPr>
-        <w:lastRenderedPageBreak/>
-        <w:t>strategic flexibility to adopt the most appropriate forecasting approach based on their specific operational priorities.</w:t>
+        <w:t>The primary objective is to evaluate predictive modeling techniques, such as regression, machine learning, and queuing simulation, to optimize airport capacity via technological rather than physical – and more costly – intervention. By analyzing the relationship between flight operations and TSA throughput, this study evaluates various predictive modeling frameworks against the primary criteria of robustness, resilience, and generalizability. Rather than seeking a singular, universally optimal model, this research identifies which frameworks perform best under each distinct metric. Ultimately, this comparative analysis provides management with the strategic flexibility to adopt the most appropriate forecasting approach based on their specific operational priorities.</w:t>
       </w:r>
     </w:p>
     <w:p>
@@ -700,7 +492,14 @@
         <w:rPr>
           <w:color w:val="000000" w:themeColor="text1"/>
         </w:rPr>
-        <w:t> (stability under convective weather and delay disruptions), or </w:t>
+        <w:t xml:space="preserve"> (stability under convective weather and delay disruptions), </w:t>
+      </w:r>
+      <w:r>
+        <w:rPr>
+          <w:color w:val="000000" w:themeColor="text1"/>
+        </w:rPr>
+        <w:lastRenderedPageBreak/>
+        <w:t>or </w:t>
       </w:r>
       <w:r>
         <w:rPr>
@@ -729,7 +528,15 @@
           <w:bCs/>
           <w:color w:val="000000" w:themeColor="text1"/>
         </w:rPr>
-        <w:t xml:space="preserve">Master Asymmetric Trade-Off Hypothesis </w:t>
+        <w:t>Master Asymmetric Trade-Off Hypothesis</w:t>
+      </w:r>
+      <w:r>
+        <w:rPr>
+          <w:b/>
+          <w:bCs/>
+          <w:color w:val="000000" w:themeColor="text1"/>
+        </w:rPr>
+        <w:t xml:space="preserve"> </w:t>
       </w:r>
       <m:oMath>
         <m:sSub>
@@ -886,15 +693,7 @@
           <w:rFonts w:ascii="Times New Roman" w:hAnsi="Times New Roman" w:cs="Times New Roman"/>
           <w:color w:val="000000" w:themeColor="text1"/>
         </w:rPr>
-        <w:t xml:space="preserve">: This study evaluates commercial air traffic and security screening operations within the contiguous United States, focusing on the Top 25 commercial </w:t>
-      </w:r>
-      <w:r>
-        <w:rPr>
-          <w:rFonts w:ascii="Times New Roman" w:hAnsi="Times New Roman" w:cs="Times New Roman"/>
-          <w:color w:val="000000" w:themeColor="text1"/>
-        </w:rPr>
-        <w:lastRenderedPageBreak/>
-        <w:t>airfields categorized under FAA hub classifications, capturing 67.2% of nationwide domestic flight departures.</w:t>
+        <w:t>: This study evaluates commercial air traffic and security screening operations within the contiguous United States, focusing on the Top 25 commercial airfields categorized under FAA hub classifications, capturing 67.2% of nationwide domestic flight departures.</w:t>
       </w:r>
     </w:p>
     <w:p>
@@ -979,6 +778,7 @@
           <w:bCs/>
           <w:color w:val="000000" w:themeColor="text1"/>
         </w:rPr>
+        <w:lastRenderedPageBreak/>
         <w:t>Data Sources</w:t>
       </w:r>
       <w:r>
@@ -1083,7 +883,6 @@
           <w:sz w:val="24"/>
           <w:szCs w:val="24"/>
         </w:rPr>
-        <w:lastRenderedPageBreak/>
         <w:t>Limitations and Assumptions</w:t>
       </w:r>
       <w:bookmarkEnd w:id="14"/>
@@ -1136,6 +935,7 @@
           <w:bCs/>
           <w:color w:val="000000" w:themeColor="text1"/>
         </w:rPr>
+        <w:lastRenderedPageBreak/>
         <w:t>Staffing and Lane Configuration Opacity</w:t>
       </w:r>
       <w:r>

</xml_diff>